<commit_message>
Add chrome.storage.local for HCcompanion accountManager
</commit_message>
<xml_diff>
--- a/documentation/product_documentation.docx
+++ b/documentation/product_documentation.docx
@@ -169,8 +169,8 @@
           <w:noProof/>
         </w:rPr>
         <w:drawing>
-          <wp:inline distT="0" distB="0" distL="0" distR="0" wp14:anchorId="6E6D4399" wp14:editId="605CC643">
-            <wp:extent cx="3277204" cy="1490345"/>
+          <wp:inline distT="0" distB="0" distL="0" distR="0" wp14:anchorId="6E6D4399" wp14:editId="63693D3D">
+            <wp:extent cx="3165764" cy="1490070"/>
             <wp:effectExtent l="0" t="0" r="0" b="0"/>
             <wp:docPr id="309020384" name="Picture 3"/>
             <wp:cNvGraphicFramePr>
@@ -201,7 +201,7 @@
                   <pic:spPr bwMode="auto">
                     <a:xfrm>
                       <a:off x="0" y="0"/>
-                      <a:ext cx="3325108" cy="1512130"/>
+                      <a:ext cx="3214962" cy="1513227"/>
                     </a:xfrm>
                     <a:prstGeom prst="rect">
                       <a:avLst/>
@@ -368,7 +368,17 @@
           <w:szCs w:val="36"/>
           <w:lang w:val="en-US"/>
         </w:rPr>
-        <w:t>by rocker_bell8</w:t>
+        <w:t xml:space="preserve">by </w:t>
+      </w:r>
+      <w:r>
+        <w:rPr>
+          <w:b/>
+          <w:bCs/>
+          <w:sz w:val="36"/>
+          <w:szCs w:val="36"/>
+          <w:lang w:val="en-US"/>
+        </w:rPr>
+        <w:t>rocker_bell8</w:t>
       </w:r>
       <w:r>
         <w:rPr>
@@ -951,6 +961,27 @@
         </w:rPr>
       </w:pPr>
     </w:p>
+    <w:p>
+      <w:pPr>
+        <w:rPr>
+          <w:lang w:val="en-US"/>
+        </w:rPr>
+      </w:pPr>
+    </w:p>
+    <w:p>
+      <w:pPr>
+        <w:rPr>
+          <w:lang w:val="en-US"/>
+        </w:rPr>
+      </w:pPr>
+    </w:p>
+    <w:p>
+      <w:pPr>
+        <w:rPr>
+          <w:lang w:val="en-US"/>
+        </w:rPr>
+      </w:pPr>
+    </w:p>
     <w:sectPr>
       <w:headerReference w:type="default" r:id="rId8"/>
       <w:footerReference w:type="default" r:id="rId9"/>
@@ -1137,6 +1168,9 @@
       <w:t xml:space="preserve">       </w:t>
     </w:r>
     <w:r>
+      <w:rPr>
+        <w:noProof/>
+      </w:rPr>
       <w:drawing>
         <wp:inline distT="0" distB="0" distL="0" distR="0" wp14:anchorId="54F510ED" wp14:editId="0B216C8D">
           <wp:extent cx="567285" cy="567285"/>
@@ -1780,6 +1814,7 @@
   <w:style w:type="character" w:default="1" w:styleId="DefaultParagraphFont">
     <w:name w:val="Default Paragraph Font"/>
     <w:uiPriority w:val="1"/>
+    <w:semiHidden/>
     <w:unhideWhenUsed/>
   </w:style>
   <w:style w:type="table" w:default="1" w:styleId="TableNormal">

</xml_diff>